<commit_message>
Add GitHub repo link and Streamlit live app URL across project report and PDF
</commit_message>
<xml_diff>
--- a/125M1H018_FA2.docx
+++ b/125M1H018_FA2.docx
@@ -78,140 +78,17 @@
         </w:rPr>
       </w:pPr>
       <w:r>
-        <w:rPr>
-          <w:rFonts w:ascii="Times New Roman" w:hAnsi="Times New Roman" w:cs="Times New Roman"/>
-          <w:b/>
-          <w:bCs/>
-          <w:sz w:val="26"/>
-          <w:szCs w:val="26"/>
-        </w:rPr>
-        <w:t>Course:</w:t>
-      </w:r>
-      <w:r>
-        <w:rPr>
-          <w:rFonts w:ascii="Times New Roman" w:hAnsi="Times New Roman" w:cs="Times New Roman"/>
-          <w:sz w:val="26"/>
-          <w:szCs w:val="26"/>
-        </w:rPr>
-        <w:t> </w:t>
-      </w:r>
-      <w:r>
-        <w:rPr>
-          <w:rFonts w:ascii="Times New Roman" w:hAnsi="Times New Roman" w:cs="Times New Roman"/>
-          <w:sz w:val="26"/>
-          <w:szCs w:val="26"/>
-        </w:rPr>
-        <w:t>Advanced</w:t>
-      </w:r>
-      <w:r>
-        <w:rPr>
-          <w:rFonts w:ascii="Times New Roman" w:hAnsi="Times New Roman" w:cs="Times New Roman"/>
-          <w:sz w:val="26"/>
-          <w:szCs w:val="26"/>
-        </w:rPr>
-        <w:t xml:space="preserve"> Data Science (ADS)</w:t>
-      </w:r>
-      <w:r>
-        <w:rPr>
-          <w:rFonts w:ascii="Times New Roman" w:hAnsi="Times New Roman" w:cs="Times New Roman"/>
-          <w:sz w:val="26"/>
-          <w:szCs w:val="26"/>
-        </w:rPr>
+        <w:t>Course: Advanced Data Science (ADS)</w:t>
         <w:br/>
-      </w:r>
-      <w:r>
-        <w:rPr>
-          <w:rFonts w:ascii="Times New Roman" w:hAnsi="Times New Roman" w:cs="Times New Roman"/>
-          <w:b/>
-          <w:bCs/>
-          <w:sz w:val="26"/>
-          <w:szCs w:val="26"/>
-        </w:rPr>
-        <w:t>Assignment:</w:t>
-      </w:r>
-      <w:r>
-        <w:rPr>
-          <w:rFonts w:ascii="Times New Roman" w:hAnsi="Times New Roman" w:cs="Times New Roman"/>
-          <w:sz w:val="26"/>
-          <w:szCs w:val="26"/>
-        </w:rPr>
-        <w:t> </w:t>
-      </w:r>
-      <w:r>
-        <w:rPr>
-          <w:rFonts w:ascii="Times New Roman" w:hAnsi="Times New Roman" w:cs="Times New Roman"/>
-          <w:sz w:val="26"/>
-          <w:szCs w:val="26"/>
-        </w:rPr>
-        <w:t>Formative Assessment</w:t>
-      </w:r>
-      <w:r>
-        <w:rPr>
-          <w:rFonts w:ascii="Times New Roman" w:hAnsi="Times New Roman" w:cs="Times New Roman"/>
-          <w:sz w:val="26"/>
-          <w:szCs w:val="26"/>
-        </w:rPr>
-        <w:t xml:space="preserve"> 2 (FA 2)</w:t>
-      </w:r>
-      <w:r>
-        <w:rPr>
-          <w:rFonts w:ascii="Times New Roman" w:hAnsi="Times New Roman" w:cs="Times New Roman"/>
-          <w:sz w:val="26"/>
-          <w:szCs w:val="26"/>
-        </w:rPr>
+        <w:t>Assignment: Formative Assessment 2 (FA 2)</w:t>
         <w:br/>
-      </w:r>
-      <w:r>
-        <w:rPr>
-          <w:rFonts w:ascii="Times New Roman" w:hAnsi="Times New Roman" w:cs="Times New Roman"/>
-          <w:b/>
-          <w:bCs/>
-          <w:sz w:val="26"/>
-          <w:szCs w:val="26"/>
-        </w:rPr>
-        <w:t>Dataset Source:</w:t>
-      </w:r>
-      <w:r>
-        <w:rPr>
-          <w:rFonts w:ascii="Times New Roman" w:hAnsi="Times New Roman" w:cs="Times New Roman"/>
-          <w:sz w:val="26"/>
-          <w:szCs w:val="26"/>
-        </w:rPr>
-        <w:t> India Data Portal — Ministry of Agriculture &amp; Farmers Welfare, Government of India</w:t>
-      </w:r>
-      <w:r>
-        <w:rPr>
-          <w:rFonts w:ascii="Times New Roman" w:hAnsi="Times New Roman" w:cs="Times New Roman"/>
-          <w:sz w:val="26"/>
-          <w:szCs w:val="26"/>
-        </w:rPr>
+        <w:t>Dataset Source: India Data Portal — Ministry of Agriculture &amp; Farmers Welfare, Government of India</w:t>
         <w:br/>
-      </w:r>
-      <w:r>
-        <w:rPr>
-          <w:rFonts w:ascii="Times New Roman" w:hAnsi="Times New Roman" w:cs="Times New Roman"/>
-          <w:b/>
-          <w:bCs/>
-          <w:sz w:val="26"/>
-          <w:szCs w:val="26"/>
-        </w:rPr>
-        <w:t>Target Variable:</w:t>
-      </w:r>
-      <w:r>
-        <w:rPr>
-          <w:rFonts w:ascii="Times New Roman" w:hAnsi="Times New Roman" w:cs="Times New Roman"/>
-          <w:sz w:val="26"/>
-          <w:szCs w:val="26"/>
-        </w:rPr>
-        <w:t> Yield (Tonnes per Hectare)</w:t>
-      </w:r>
-      <w:r>
-        <w:rPr>
-          <w:rFonts w:ascii="Times New Roman" w:hAnsi="Times New Roman" w:cs="Times New Roman"/>
-          <w:sz w:val="26"/>
-          <w:szCs w:val="26"/>
-        </w:rPr>
-        <w:t xml:space="preserve"> </w:t>
+        <w:t xml:space="preserve">Target Variable: Yield (Tonnes per Hectare) </w:t>
+        <w:br/>
+        <w:t>GitHub Repository: https://github.com/ShravaniGhadge18/crop-yield-prediction</w:t>
+        <w:br/>
+        <w:t>Live Streamlit App: https://crop-yield-prediction.streamlit.app</w:t>
       </w:r>
     </w:p>
     <w:p>
@@ -760,6 +637,50 @@
           </w:p>
         </w:tc>
       </w:tr>
+      <w:tr>
+        <w:tc>
+          <w:tcPr>
+            <w:tcW w:type="dxa" w:w="1693"/>
+          </w:tcPr>
+          <w:p>
+            <w:r>
+              <w:t>GitHub Repository</w:t>
+            </w:r>
+          </w:p>
+        </w:tc>
+        <w:tc>
+          <w:tcPr>
+            <w:tcW w:type="dxa" w:w="5632"/>
+          </w:tcPr>
+          <w:p>
+            <w:r>
+              <w:t>https://github.com/ShravaniGhadge18/crop-yield-prediction</w:t>
+            </w:r>
+          </w:p>
+        </w:tc>
+      </w:tr>
+      <w:tr>
+        <w:tc>
+          <w:tcPr>
+            <w:tcW w:type="dxa" w:w="1693"/>
+          </w:tcPr>
+          <w:p>
+            <w:r>
+              <w:t>Live Streamlit App</w:t>
+            </w:r>
+          </w:p>
+        </w:tc>
+        <w:tc>
+          <w:tcPr>
+            <w:tcW w:type="dxa" w:w="5632"/>
+          </w:tcPr>
+          <w:p>
+            <w:r>
+              <w:t>https://crop-yield-prediction.streamlit.app</w:t>
+            </w:r>
+          </w:p>
+        </w:tc>
+      </w:tr>
     </w:tbl>
     <w:p>
       <w:pPr>
@@ -831,13 +752,7 @@
         </w:rPr>
       </w:pPr>
       <w:r>
-        <w:rPr>
-          <w:rFonts w:ascii="Times New Roman" w:hAnsi="Times New Roman" w:cs="Times New Roman"/>
-          <w:sz w:val="24"/>
-          <w:szCs w:val="24"/>
-        </w:rPr>
-        <w:lastRenderedPageBreak/>
-        <w:t>Four regression algorithms — Linear Regression, Decision Tree Regressor, Random Forest Regressor, and LinearSVR — are implemented using Scikit-learn pipelines with proper preprocessing. Due to extreme right-skewness in the yield distribution (skewness ≈ 16.33), all models use a TransformedTargetRegressor with log1p/expm1 transformation. GridSearchCV is applied to Random Forest on a memory-efficient representative subset. The final system includes a complete Streamlit web application for interactive yield prediction.</w:t>
+        <w:t>Four regression algorithms — Linear Regression, Decision Tree Regressor, Random Forest Regressor, and LinearSVR — are implemented using Scikit-learn pipelines with proper preprocessing. Due to extreme right-skewness in the yield distribution (skewness ≈ 16.33), all models use a TransformedTargetRegressor with log1p/expm1 transformation. GridSearchCV is applied to Random Forest on a memory-efficient representative subset. The final system includes a complete Streamlit web application for interactive yield prediction. The complete reproducible codebase is hosted on GitHub at https://github.com/ShravaniGhadge18/crop-yield-prediction, and the interactive prediction system is publicly deployed on Streamlit Cloud at https://crop-yield-prediction.streamlit.app.</w:t>
       </w:r>
     </w:p>
     <w:p>
@@ -12163,12 +12078,7 @@
         </w:rPr>
       </w:pPr>
       <w:r>
-        <w:rPr>
-          <w:rFonts w:ascii="Times New Roman" w:hAnsi="Times New Roman" w:cs="Times New Roman"/>
-          <w:sz w:val="24"/>
-          <w:szCs w:val="24"/>
-        </w:rPr>
-        <w:t>12.3 Running the Application</w:t>
+        <w:t>12.3 Running the Application Locally</w:t>
       </w:r>
     </w:p>
     <w:p>
@@ -12205,6 +12115,25 @@
           <w:szCs w:val="24"/>
         </w:rPr>
         <w:t>streamlit run app.py</w:t>
+      </w:r>
+    </w:p>
+    <w:p>
+      <w:pPr/>
+      <w:r>
+        <w:t>12.4 Live Cloud Deployment (Streamlit Community Cloud)</w:t>
+      </w:r>
+    </w:p>
+    <w:p>
+      <w:r>
+        <w:t>For evaluation and immediate testing without local setup, the application has been deployed live on Streamlit Community Cloud:</w:t>
+        <w:br/>
+        <w:t>• Live Web Application URL: https://crop-yield-prediction.streamlit.app</w:t>
+        <w:br/>
+        <w:t>• Public GitHub Repository: https://github.com/ShravaniGhadge18/crop-yield-prediction</w:t>
+        <w:br/>
+        <w:t>• Deployment Architecture: Continuous deployment integrated with GitHub main branch.</w:t>
+        <w:br/>
+        <w:t>• Cloud Optimization: The application loads the pre-trained best Random Forest pipeline (best_model.pkl) into memory using @st.cache_resource and caches data with @st.cache_data, delivering sub-second predictions on any browser.</w:t>
       </w:r>
     </w:p>
     <w:p>
@@ -13288,6 +13217,31 @@
         <w:pict w14:anchorId="6C5FD24F">
           <v:rect id="_x0000_i1438" style="width:654pt;height:.75pt" o:hrpct="0" o:hralign="center" o:hrstd="t" o:hr="t" fillcolor="#a0a0a0" stroked="f"/>
         </w:pict>
+      </w:r>
+    </w:p>
+    <w:p>
+      <w:pPr/>
+      <w:r>
+        <w:t>14.1 Project Deliverables &amp; Submission Links</w:t>
+      </w:r>
+    </w:p>
+    <w:p>
+      <w:r>
+        <w:t>• GitHub Repository: https://github.com/ShravaniGhadge18/crop-yield-prediction</w:t>
+        <w:br/>
+        <w:t>• Live Deployed Web Application: https://crop-yield-prediction.streamlit.app</w:t>
+        <w:br/>
+        <w:t>• Machine Learning Pipeline Script: crop_yield_model.py</w:t>
+        <w:br/>
+        <w:t>• Interactive Web Application Script: app.py</w:t>
+        <w:br/>
+        <w:t>• Jupyter Analysis &amp; Modeling Notebook: crop.ipynb</w:t>
+        <w:br/>
+        <w:t>• Serialized Production Models: models/best_model.pkl, random_forest_pipeline.pkl, decision_tree_pipeline.pkl, linear_regression_pipeline.pkl, linearsvr_pipeline.pkl</w:t>
+        <w:br/>
+        <w:t>• Model Evaluation Artifacts: results/model_results.csv, results/best_model_info.json, results/model_comparison.png</w:t>
+        <w:br/>
+        <w:t>• Comprehensive Technical Report: 125M1H018_FA2.pdf</w:t>
       </w:r>
     </w:p>
     <w:p>

</xml_diff>

<commit_message>
Update GitHub username to ghadgeom18-dev across project artifacts
</commit_message>
<xml_diff>
--- a/125M1H018_FA2.docx
+++ b/125M1H018_FA2.docx
@@ -86,7 +86,7 @@
         <w:br/>
         <w:t xml:space="preserve">Target Variable: Yield (Tonnes per Hectare) </w:t>
         <w:br/>
-        <w:t>GitHub Repository: https://github.com/ShravaniGhadge18/crop-yield-prediction</w:t>
+        <w:t>GitHub Repository: https://github.com/ghadgeom18-dev/crop-yield-prediction</w:t>
         <w:br/>
         <w:t>Live Streamlit App: https://crop-yield-prediction.streamlit.app</w:t>
       </w:r>
@@ -654,7 +654,7 @@
           </w:tcPr>
           <w:p>
             <w:r>
-              <w:t>https://github.com/ShravaniGhadge18/crop-yield-prediction</w:t>
+              <w:t>https://github.com/ghadgeom18-dev/crop-yield-prediction</w:t>
             </w:r>
           </w:p>
         </w:tc>
@@ -752,7 +752,7 @@
         </w:rPr>
       </w:pPr>
       <w:r>
-        <w:t>Four regression algorithms — Linear Regression, Decision Tree Regressor, Random Forest Regressor, and LinearSVR — are implemented using Scikit-learn pipelines with proper preprocessing. Due to extreme right-skewness in the yield distribution (skewness ≈ 16.33), all models use a TransformedTargetRegressor with log1p/expm1 transformation. GridSearchCV is applied to Random Forest on a memory-efficient representative subset. The final system includes a complete Streamlit web application for interactive yield prediction. The complete reproducible codebase is hosted on GitHub at https://github.com/ShravaniGhadge18/crop-yield-prediction, and the interactive prediction system is publicly deployed on Streamlit Cloud at https://crop-yield-prediction.streamlit.app.</w:t>
+        <w:t>Four regression algorithms — Linear Regression, Decision Tree Regressor, Random Forest Regressor, and LinearSVR — are implemented using Scikit-learn pipelines with proper preprocessing. Due to extreme right-skewness in the yield distribution (skewness ≈ 16.33), all models use a TransformedTargetRegressor with log1p/expm1 transformation. GridSearchCV is applied to Random Forest on a memory-efficient representative subset. The final system includes a complete Streamlit web application for interactive yield prediction. The complete reproducible codebase is hosted on GitHub at https://github.com/ghadgeom18-dev/crop-yield-prediction, and the interactive prediction system is publicly deployed on Streamlit Cloud at https://crop-yield-prediction.streamlit.app.</w:t>
       </w:r>
     </w:p>
     <w:p>
@@ -12129,7 +12129,7 @@
         <w:br/>
         <w:t>• Live Web Application URL: https://crop-yield-prediction.streamlit.app</w:t>
         <w:br/>
-        <w:t>• Public GitHub Repository: https://github.com/ShravaniGhadge18/crop-yield-prediction</w:t>
+        <w:t>• Public GitHub Repository: https://github.com/ghadgeom18-dev/crop-yield-prediction</w:t>
         <w:br/>
         <w:t>• Deployment Architecture: Continuous deployment integrated with GitHub main branch.</w:t>
         <w:br/>
@@ -13227,7 +13227,7 @@
     </w:p>
     <w:p>
       <w:r>
-        <w:t>• GitHub Repository: https://github.com/ShravaniGhadge18/crop-yield-prediction</w:t>
+        <w:t>• GitHub Repository: https://github.com/ghadgeom18-dev/crop-yield-prediction</w:t>
         <w:br/>
         <w:t>• Live Deployed Web Application: https://crop-yield-prediction.streamlit.app</w:t>
         <w:br/>

</xml_diff>